<commit_message>
update and add simulator
</commit_message>
<xml_diff>
--- a/DX-CT511N/Manual/BMS 无线通讯说明书 DX-CT511N.docx
+++ b/DX-CT511N/Manual/BMS 无线通讯说明书 DX-CT511N.docx
@@ -4223,7 +4223,7 @@
                 <w:rFonts w:ascii="Consolas" w:eastAsia="SimSun" w:hAnsi="Consolas"/>
                 <w:szCs w:val="20"/>
               </w:rPr>
-              <w:t>AT+GPSSTEX</w:t>
+              <w:t>REQ_GPS_UPDATE</w:t>
             </w:r>
           </w:p>
         </w:tc>
@@ -8165,23 +8165,22 @@
         <w:rPr>
           <w:rFonts w:ascii="Consolas" w:eastAsia="SimSun" w:hAnsi="Consolas"/>
           <w:szCs w:val="20"/>
+        </w:rPr>
+      </w:pPr>
+      <w:r>
+        <w:rPr>
+          <w:rFonts w:ascii="Consolas" w:eastAsia="SimSun" w:hAnsi="Consolas" w:hint="eastAsia"/>
+          <w:szCs w:val="20"/>
           <w:lang w:eastAsia="zh-CN"/>
         </w:rPr>
-      </w:pPr>
+        <w:t xml:space="preserve"># </w:t>
+      </w:r>
       <w:r>
         <w:rPr>
           <w:rFonts w:ascii="Consolas" w:eastAsia="SimSun" w:hAnsi="Consolas" w:hint="eastAsia"/>
           <w:szCs w:val="20"/>
           <w:lang w:eastAsia="zh-CN"/>
         </w:rPr>
-        <w:t xml:space="preserve"># </w:t>
-      </w:r>
-      <w:r>
-        <w:rPr>
-          <w:rFonts w:ascii="Consolas" w:eastAsia="SimSun" w:hAnsi="Consolas" w:hint="eastAsia"/>
-          <w:szCs w:val="20"/>
-          <w:lang w:eastAsia="zh-CN"/>
-        </w:rPr>
         <w:t>返回</w:t>
       </w:r>
       <w:r>
@@ -8189,7 +8188,7 @@
           <w:rFonts w:ascii="Consolas" w:eastAsia="SimSun" w:hAnsi="Consolas"/>
           <w:szCs w:val="20"/>
         </w:rPr>
-        <w:t>AT+GPSSTEX</w:t>
+        <w:t>REQ_GPS_UPDATE</w:t>
       </w:r>
       <w:r>
         <w:rPr>
@@ -10532,7 +10531,6 @@
   <w:style w:type="character" w:default="1" w:styleId="DefaultParagraphFont">
     <w:name w:val="Default Paragraph Font"/>
     <w:uiPriority w:val="1"/>
-    <w:semiHidden/>
     <w:unhideWhenUsed/>
   </w:style>
   <w:style w:type="table" w:default="1" w:styleId="TableNormal">

</xml_diff>